<commit_message>
Niagara Sprite Muzzle Flash
</commit_message>
<xml_diff>
--- a/Visual/Textures/EmuPage.docx
+++ b/Visual/Textures/EmuPage.docx
@@ -361,15 +361,7 @@
             </w:r>
             <w:proofErr w:type="spellEnd"/>
             <w:r>
-              <w:t xml:space="preserve"> </w:t>
-            </w:r>
-            <w:proofErr w:type="spellStart"/>
-            <w:r>
-              <w:t>esse</w:t>
-            </w:r>
-            <w:proofErr w:type="spellEnd"/>
-            <w:r>
-              <w:t xml:space="preserve"> </w:t>
+              <w:t xml:space="preserve"> esse </w:t>
             </w:r>
             <w:proofErr w:type="spellStart"/>
             <w:r>
@@ -484,15 +476,7 @@
             </w:r>
             <w:proofErr w:type="spellEnd"/>
             <w:r>
-              <w:t xml:space="preserve"> id </w:t>
-            </w:r>
-            <w:proofErr w:type="spellStart"/>
-            <w:r>
-              <w:t>est</w:t>
-            </w:r>
-            <w:proofErr w:type="spellEnd"/>
-            <w:r>
-              <w:t xml:space="preserve"> </w:t>
+              <w:t xml:space="preserve"> id est </w:t>
             </w:r>
             <w:proofErr w:type="spellStart"/>
             <w:r>
@@ -500,10 +484,7 @@
             </w:r>
             <w:proofErr w:type="spellEnd"/>
             <w:r>
-              <w:t>.</w:t>
-            </w:r>
-            <w:r>
-              <w:t xml:space="preserve"> </w:t>
+              <w:t xml:space="preserve">. </w:t>
             </w:r>
             <w:r>
               <w:t xml:space="preserve">The Australian times </w:t>
@@ -655,10 +636,7 @@
               <w:pStyle w:val="Heading2"/>
             </w:pPr>
             <w:r>
-              <w:t xml:space="preserve">HEADLINE </w:t>
-            </w:r>
-            <w:r>
-              <w:t>2</w:t>
+              <w:t>HEADLINE 2</w:t>
             </w:r>
           </w:p>
           <w:p>
@@ -1162,7 +1140,7 @@
               <w:pStyle w:val="Heading2"/>
             </w:pPr>
             <w:r>
-              <w:t>HEADLINE 5</w:t>
+              <w:t>Party Members</w:t>
             </w:r>
           </w:p>
           <w:p>
@@ -1441,10 +1419,7 @@
               <w:pStyle w:val="Heading2"/>
             </w:pPr>
             <w:r>
-              <w:t xml:space="preserve">HEADLINE </w:t>
-            </w:r>
-            <w:r>
-              <w:t>6</w:t>
+              <w:t>HEADLINE 6</w:t>
             </w:r>
           </w:p>
           <w:p>
@@ -1651,10 +1626,7 @@
               <w:pStyle w:val="Heading2"/>
             </w:pPr>
             <w:r>
-              <w:t xml:space="preserve">HEADLINE </w:t>
-            </w:r>
-            <w:r>
-              <w:t>7</w:t>
+              <w:t>Mode</w:t>
             </w:r>
           </w:p>
           <w:p>
@@ -1938,6 +1910,1961 @@
       </w:tr>
     </w:tbl>
     <w:p/>
+    <w:p>
+      <w:pPr>
+        <w:spacing w:after="160" w:line="259" w:lineRule="auto"/>
+      </w:pPr>
+      <w:r>
+        <w:br w:type="page"/>
+      </w:r>
+    </w:p>
+    <w:p>
+      <w:pPr>
+        <w:pStyle w:val="Title"/>
+      </w:pPr>
+      <w:r>
+        <w:lastRenderedPageBreak/>
+        <w:t>The Australian Times</w:t>
+      </w:r>
+    </w:p>
+    <w:tbl>
+      <w:tblPr>
+        <w:tblStyle w:val="TableGrid"/>
+        <w:tblW w:w="11340" w:type="dxa"/>
+        <w:tblBorders>
+          <w:top w:val="none" w:sz="0" w:space="0" w:color="auto"/>
+          <w:left w:val="none" w:sz="0" w:space="0" w:color="auto"/>
+          <w:bottom w:val="none" w:sz="0" w:space="0" w:color="auto"/>
+          <w:right w:val="none" w:sz="0" w:space="0" w:color="auto"/>
+          <w:insideH w:val="none" w:sz="0" w:space="0" w:color="auto"/>
+          <w:insideV w:val="none" w:sz="0" w:space="0" w:color="auto"/>
+        </w:tblBorders>
+        <w:tblLook w:val="04A0" w:firstRow="1" w:lastRow="0" w:firstColumn="1" w:lastColumn="0" w:noHBand="0" w:noVBand="1"/>
+      </w:tblPr>
+      <w:tblGrid>
+        <w:gridCol w:w="2835"/>
+        <w:gridCol w:w="2835"/>
+        <w:gridCol w:w="2835"/>
+        <w:gridCol w:w="2835"/>
+      </w:tblGrid>
+      <w:tr>
+        <w:tc>
+          <w:tcPr>
+            <w:tcW w:w="5670" w:type="dxa"/>
+            <w:gridSpan w:val="2"/>
+            <w:tcBorders>
+              <w:top w:val="single" w:sz="4" w:space="0" w:color="auto"/>
+              <w:right w:val="single" w:sz="4" w:space="0" w:color="auto"/>
+            </w:tcBorders>
+          </w:tcPr>
+          <w:p>
+            <w:pPr>
+              <w:pStyle w:val="Heading2"/>
+            </w:pPr>
+            <w:r>
+              <w:t>EMUS ON THE OFFENSIVE</w:t>
+            </w:r>
+          </w:p>
+        </w:tc>
+        <w:tc>
+          <w:tcPr>
+            <w:tcW w:w="5670" w:type="dxa"/>
+            <w:gridSpan w:val="2"/>
+            <w:vMerge w:val="restart"/>
+            <w:tcBorders>
+              <w:top w:val="single" w:sz="4" w:space="0" w:color="auto"/>
+              <w:left w:val="single" w:sz="4" w:space="0" w:color="auto"/>
+            </w:tcBorders>
+          </w:tcPr>
+          <w:p>
+            <w:pPr>
+              <w:jc w:val="center"/>
+            </w:pPr>
+            <w:r>
+              <w:rPr>
+                <w:noProof/>
+              </w:rPr>
+              <w:drawing>
+                <wp:inline distT="0" distB="0" distL="0" distR="0" wp14:anchorId="211B4F9C" wp14:editId="2FC9E2F3">
+                  <wp:extent cx="2777706" cy="3381555"/>
+                  <wp:effectExtent l="0" t="0" r="3810" b="0"/>
+                  <wp:docPr id="555720605" name="Picture 1" descr="The Great Emu War"/>
+                  <wp:cNvGraphicFramePr>
+                    <a:graphicFrameLocks xmlns:a="http://schemas.openxmlformats.org/drawingml/2006/main" noChangeAspect="1"/>
+                  </wp:cNvGraphicFramePr>
+                  <a:graphic xmlns:a="http://schemas.openxmlformats.org/drawingml/2006/main">
+                    <a:graphicData uri="http://schemas.openxmlformats.org/drawingml/2006/picture">
+                      <pic:pic xmlns:pic="http://schemas.openxmlformats.org/drawingml/2006/picture">
+                        <pic:nvPicPr>
+                          <pic:cNvPr id="0" name="Picture 1" descr="The Great Emu War"/>
+                          <pic:cNvPicPr>
+                            <a:picLocks noChangeAspect="1" noChangeArrowheads="1"/>
+                          </pic:cNvPicPr>
+                        </pic:nvPicPr>
+                        <pic:blipFill>
+                          <a:blip r:embed="rId4">
+                            <a:extLst>
+                              <a:ext uri="{28A0092B-C50C-407E-A947-70E740481C1C}">
+                                <a14:useLocalDpi xmlns:a14="http://schemas.microsoft.com/office/drawing/2010/main" val="0"/>
+                              </a:ext>
+                            </a:extLst>
+                          </a:blip>
+                          <a:srcRect/>
+                          <a:stretch>
+                            <a:fillRect/>
+                          </a:stretch>
+                        </pic:blipFill>
+                        <pic:spPr bwMode="auto">
+                          <a:xfrm>
+                            <a:off x="0" y="0"/>
+                            <a:ext cx="2799941" cy="3408623"/>
+                          </a:xfrm>
+                          <a:prstGeom prst="rect">
+                            <a:avLst/>
+                          </a:prstGeom>
+                          <a:noFill/>
+                          <a:ln>
+                            <a:noFill/>
+                          </a:ln>
+                        </pic:spPr>
+                      </pic:pic>
+                    </a:graphicData>
+                  </a:graphic>
+                </wp:inline>
+              </w:drawing>
+            </w:r>
+          </w:p>
+        </w:tc>
+      </w:tr>
+      <w:tr>
+        <w:tc>
+          <w:tcPr>
+            <w:tcW w:w="2835" w:type="dxa"/>
+            <w:tcBorders>
+              <w:bottom w:val="single" w:sz="4" w:space="0" w:color="auto"/>
+            </w:tcBorders>
+          </w:tcPr>
+          <w:p>
+            <w:r>
+              <w:t xml:space="preserve">Lorem ipsum </w:t>
+            </w:r>
+            <w:proofErr w:type="spellStart"/>
+            <w:r>
+              <w:t>dolor</w:t>
+            </w:r>
+            <w:proofErr w:type="spellEnd"/>
+            <w:r>
+              <w:t xml:space="preserve"> </w:t>
+            </w:r>
+            <w:proofErr w:type="gramStart"/>
+            <w:r>
+              <w:t>sit</w:t>
+            </w:r>
+            <w:proofErr w:type="gramEnd"/>
+            <w:r>
+              <w:t xml:space="preserve"> </w:t>
+            </w:r>
+            <w:proofErr w:type="spellStart"/>
+            <w:r>
+              <w:t>amet</w:t>
+            </w:r>
+            <w:proofErr w:type="spellEnd"/>
+            <w:r>
+              <w:t xml:space="preserve">, </w:t>
+            </w:r>
+            <w:proofErr w:type="spellStart"/>
+            <w:r>
+              <w:t>consectetur</w:t>
+            </w:r>
+            <w:proofErr w:type="spellEnd"/>
+            <w:r>
+              <w:t xml:space="preserve"> </w:t>
+            </w:r>
+            <w:proofErr w:type="spellStart"/>
+            <w:r>
+              <w:t>adipiscing</w:t>
+            </w:r>
+            <w:proofErr w:type="spellEnd"/>
+            <w:r>
+              <w:t xml:space="preserve"> </w:t>
+            </w:r>
+            <w:proofErr w:type="spellStart"/>
+            <w:r>
+              <w:t>elit</w:t>
+            </w:r>
+            <w:proofErr w:type="spellEnd"/>
+            <w:r>
+              <w:t xml:space="preserve">, sed do </w:t>
+            </w:r>
+            <w:proofErr w:type="spellStart"/>
+            <w:r>
+              <w:t>eiusmod</w:t>
+            </w:r>
+            <w:proofErr w:type="spellEnd"/>
+            <w:r>
+              <w:t xml:space="preserve"> </w:t>
+            </w:r>
+            <w:proofErr w:type="spellStart"/>
+            <w:r>
+              <w:t>tempor</w:t>
+            </w:r>
+            <w:proofErr w:type="spellEnd"/>
+            <w:r>
+              <w:t xml:space="preserve"> </w:t>
+            </w:r>
+            <w:proofErr w:type="spellStart"/>
+            <w:r>
+              <w:t>incididunt</w:t>
+            </w:r>
+            <w:proofErr w:type="spellEnd"/>
+            <w:r>
+              <w:t xml:space="preserve"> </w:t>
+            </w:r>
+            <w:proofErr w:type="spellStart"/>
+            <w:r>
+              <w:t>ut</w:t>
+            </w:r>
+            <w:proofErr w:type="spellEnd"/>
+            <w:r>
+              <w:t xml:space="preserve"> labore et dolore magna </w:t>
+            </w:r>
+            <w:proofErr w:type="spellStart"/>
+            <w:r>
+              <w:t>aliqua</w:t>
+            </w:r>
+            <w:proofErr w:type="spellEnd"/>
+            <w:r>
+              <w:t xml:space="preserve">. Ut </w:t>
+            </w:r>
+            <w:proofErr w:type="spellStart"/>
+            <w:r>
+              <w:t>enim</w:t>
+            </w:r>
+            <w:proofErr w:type="spellEnd"/>
+            <w:r>
+              <w:t xml:space="preserve"> ad minim </w:t>
+            </w:r>
+            <w:proofErr w:type="spellStart"/>
+            <w:r>
+              <w:t>veniam</w:t>
+            </w:r>
+            <w:proofErr w:type="spellEnd"/>
+            <w:r>
+              <w:t xml:space="preserve">, </w:t>
+            </w:r>
+            <w:proofErr w:type="spellStart"/>
+            <w:r>
+              <w:t>quis</w:t>
+            </w:r>
+            <w:proofErr w:type="spellEnd"/>
+            <w:r>
+              <w:t xml:space="preserve"> </w:t>
+            </w:r>
+            <w:proofErr w:type="spellStart"/>
+            <w:r>
+              <w:t>nostrud</w:t>
+            </w:r>
+            <w:proofErr w:type="spellEnd"/>
+            <w:r>
+              <w:t xml:space="preserve"> exercitation </w:t>
+            </w:r>
+            <w:proofErr w:type="spellStart"/>
+            <w:r>
+              <w:t>ullamco</w:t>
+            </w:r>
+            <w:proofErr w:type="spellEnd"/>
+            <w:r>
+              <w:t xml:space="preserve"> </w:t>
+            </w:r>
+            <w:proofErr w:type="spellStart"/>
+            <w:r>
+              <w:t>laboris</w:t>
+            </w:r>
+            <w:proofErr w:type="spellEnd"/>
+            <w:r>
+              <w:t xml:space="preserve"> nisi </w:t>
+            </w:r>
+            <w:proofErr w:type="spellStart"/>
+            <w:r>
+              <w:t>ut</w:t>
+            </w:r>
+            <w:proofErr w:type="spellEnd"/>
+            <w:r>
+              <w:t xml:space="preserve"> </w:t>
+            </w:r>
+            <w:proofErr w:type="spellStart"/>
+            <w:r>
+              <w:t>aliquip</w:t>
+            </w:r>
+            <w:proofErr w:type="spellEnd"/>
+            <w:r>
+              <w:t xml:space="preserve"> ex </w:t>
+            </w:r>
+            <w:proofErr w:type="spellStart"/>
+            <w:r>
+              <w:t>ea</w:t>
+            </w:r>
+            <w:proofErr w:type="spellEnd"/>
+            <w:r>
+              <w:t xml:space="preserve"> </w:t>
+            </w:r>
+            <w:proofErr w:type="spellStart"/>
+            <w:r>
+              <w:t>commodo</w:t>
+            </w:r>
+            <w:proofErr w:type="spellEnd"/>
+            <w:r>
+              <w:t xml:space="preserve"> </w:t>
+            </w:r>
+            <w:proofErr w:type="spellStart"/>
+            <w:r>
+              <w:t>consequat</w:t>
+            </w:r>
+            <w:proofErr w:type="spellEnd"/>
+            <w:r>
+              <w:t xml:space="preserve">. Duis </w:t>
+            </w:r>
+            <w:proofErr w:type="spellStart"/>
+            <w:r>
+              <w:t>aute</w:t>
+            </w:r>
+            <w:proofErr w:type="spellEnd"/>
+            <w:r>
+              <w:t xml:space="preserve"> </w:t>
+            </w:r>
+            <w:proofErr w:type="spellStart"/>
+            <w:r>
+              <w:t>irure</w:t>
+            </w:r>
+            <w:proofErr w:type="spellEnd"/>
+            <w:r>
+              <w:t xml:space="preserve"> </w:t>
+            </w:r>
+            <w:proofErr w:type="spellStart"/>
+            <w:r>
+              <w:t>dolor</w:t>
+            </w:r>
+            <w:proofErr w:type="spellEnd"/>
+            <w:r>
+              <w:t xml:space="preserve"> in </w:t>
+            </w:r>
+            <w:proofErr w:type="spellStart"/>
+            <w:r>
+              <w:t>reprehenderit</w:t>
+            </w:r>
+            <w:proofErr w:type="spellEnd"/>
+            <w:r>
+              <w:t xml:space="preserve"> in </w:t>
+            </w:r>
+            <w:proofErr w:type="spellStart"/>
+            <w:r>
+              <w:t>voluptate</w:t>
+            </w:r>
+            <w:proofErr w:type="spellEnd"/>
+            <w:r>
+              <w:t xml:space="preserve"> </w:t>
+            </w:r>
+            <w:proofErr w:type="spellStart"/>
+            <w:r>
+              <w:t>velit</w:t>
+            </w:r>
+            <w:proofErr w:type="spellEnd"/>
+            <w:r>
+              <w:t xml:space="preserve"> esse </w:t>
+            </w:r>
+            <w:proofErr w:type="spellStart"/>
+            <w:r>
+              <w:t>cillum</w:t>
+            </w:r>
+            <w:proofErr w:type="spellEnd"/>
+            <w:r>
+              <w:t xml:space="preserve"> dolore </w:t>
+            </w:r>
+            <w:proofErr w:type="spellStart"/>
+            <w:r>
+              <w:t>eu</w:t>
+            </w:r>
+            <w:proofErr w:type="spellEnd"/>
+            <w:r>
+              <w:t xml:space="preserve"> </w:t>
+            </w:r>
+            <w:proofErr w:type="spellStart"/>
+            <w:r>
+              <w:t>fugiat</w:t>
+            </w:r>
+            <w:proofErr w:type="spellEnd"/>
+            <w:r>
+              <w:t xml:space="preserve"> nulla </w:t>
+            </w:r>
+            <w:proofErr w:type="spellStart"/>
+            <w:r>
+              <w:t>pariatur</w:t>
+            </w:r>
+            <w:proofErr w:type="spellEnd"/>
+            <w:r>
+              <w:t>.</w:t>
+            </w:r>
+          </w:p>
+        </w:tc>
+        <w:tc>
+          <w:tcPr>
+            <w:tcW w:w="2835" w:type="dxa"/>
+            <w:tcBorders>
+              <w:bottom w:val="single" w:sz="4" w:space="0" w:color="auto"/>
+              <w:right w:val="single" w:sz="4" w:space="0" w:color="auto"/>
+            </w:tcBorders>
+          </w:tcPr>
+          <w:p>
+            <w:proofErr w:type="spellStart"/>
+            <w:r>
+              <w:t>Excepteur</w:t>
+            </w:r>
+            <w:proofErr w:type="spellEnd"/>
+            <w:r>
+              <w:t xml:space="preserve"> </w:t>
+            </w:r>
+            <w:proofErr w:type="spellStart"/>
+            <w:r>
+              <w:t>sint</w:t>
+            </w:r>
+            <w:proofErr w:type="spellEnd"/>
+            <w:r>
+              <w:t xml:space="preserve"> </w:t>
+            </w:r>
+            <w:proofErr w:type="spellStart"/>
+            <w:r>
+              <w:t>occaecat</w:t>
+            </w:r>
+            <w:proofErr w:type="spellEnd"/>
+            <w:r>
+              <w:t xml:space="preserve"> </w:t>
+            </w:r>
+            <w:proofErr w:type="spellStart"/>
+            <w:r>
+              <w:t>cupidatat</w:t>
+            </w:r>
+            <w:proofErr w:type="spellEnd"/>
+            <w:r>
+              <w:t xml:space="preserve"> non </w:t>
+            </w:r>
+            <w:proofErr w:type="spellStart"/>
+            <w:r>
+              <w:t>proident</w:t>
+            </w:r>
+            <w:proofErr w:type="spellEnd"/>
+            <w:r>
+              <w:t xml:space="preserve">, sunt in culpa qui </w:t>
+            </w:r>
+            <w:proofErr w:type="spellStart"/>
+            <w:r>
+              <w:t>officia</w:t>
+            </w:r>
+            <w:proofErr w:type="spellEnd"/>
+            <w:r>
+              <w:t xml:space="preserve"> </w:t>
+            </w:r>
+            <w:proofErr w:type="spellStart"/>
+            <w:r>
+              <w:t>deserunt</w:t>
+            </w:r>
+            <w:proofErr w:type="spellEnd"/>
+            <w:r>
+              <w:t xml:space="preserve"> </w:t>
+            </w:r>
+            <w:proofErr w:type="spellStart"/>
+            <w:r>
+              <w:t>mollit</w:t>
+            </w:r>
+            <w:proofErr w:type="spellEnd"/>
+            <w:r>
+              <w:t xml:space="preserve"> </w:t>
+            </w:r>
+            <w:proofErr w:type="spellStart"/>
+            <w:r>
+              <w:t>anim</w:t>
+            </w:r>
+            <w:proofErr w:type="spellEnd"/>
+            <w:r>
+              <w:t xml:space="preserve"> id est </w:t>
+            </w:r>
+            <w:proofErr w:type="spellStart"/>
+            <w:r>
+              <w:t>laborum</w:t>
+            </w:r>
+            <w:proofErr w:type="spellEnd"/>
+            <w:r>
+              <w:t xml:space="preserve">. </w:t>
+            </w:r>
+            <w:r>
+              <w:t xml:space="preserve">The Australian times </w:t>
+            </w:r>
+            <w:proofErr w:type="gramStart"/>
+            <w:r>
+              <w:t>actually can’t</w:t>
+            </w:r>
+            <w:proofErr w:type="gramEnd"/>
+            <w:r>
+              <w:t xml:space="preserve"> find the original source of this emu image. A reverse image search shows it goes back to Pinterest in </w:t>
+            </w:r>
+            <w:proofErr w:type="gramStart"/>
+            <w:r>
+              <w:t>2016</w:t>
+            </w:r>
+            <w:proofErr w:type="gramEnd"/>
+            <w:r>
+              <w:t xml:space="preserve"> but we can’t find the original author to credit them. “It’s such a funny picture.” says Sir George Pearce, Minister of Defence.</w:t>
+            </w:r>
+          </w:p>
+        </w:tc>
+        <w:tc>
+          <w:tcPr>
+            <w:tcW w:w="5670" w:type="dxa"/>
+            <w:gridSpan w:val="2"/>
+            <w:vMerge/>
+            <w:tcBorders>
+              <w:left w:val="single" w:sz="4" w:space="0" w:color="auto"/>
+              <w:bottom w:val="single" w:sz="4" w:space="0" w:color="auto"/>
+            </w:tcBorders>
+          </w:tcPr>
+          <w:p/>
+        </w:tc>
+      </w:tr>
+      <w:tr>
+        <w:tc>
+          <w:tcPr>
+            <w:tcW w:w="2835" w:type="dxa"/>
+            <w:vMerge w:val="restart"/>
+            <w:tcBorders>
+              <w:top w:val="single" w:sz="4" w:space="0" w:color="auto"/>
+              <w:right w:val="single" w:sz="4" w:space="0" w:color="auto"/>
+            </w:tcBorders>
+          </w:tcPr>
+          <w:p>
+            <w:pPr>
+              <w:pStyle w:val="Heading2"/>
+            </w:pPr>
+            <w:r>
+              <w:t>THE GREAT DEPRESSION IS AMONG US</w:t>
+            </w:r>
+          </w:p>
+          <w:p>
+            <w:r>
+              <w:t xml:space="preserve">Lorem ipsum </w:t>
+            </w:r>
+            <w:proofErr w:type="spellStart"/>
+            <w:r>
+              <w:t>dolor</w:t>
+            </w:r>
+            <w:proofErr w:type="spellEnd"/>
+            <w:r>
+              <w:t xml:space="preserve"> </w:t>
+            </w:r>
+            <w:proofErr w:type="gramStart"/>
+            <w:r>
+              <w:t>sit</w:t>
+            </w:r>
+            <w:proofErr w:type="gramEnd"/>
+            <w:r>
+              <w:t xml:space="preserve"> </w:t>
+            </w:r>
+            <w:proofErr w:type="spellStart"/>
+            <w:r>
+              <w:t>amet</w:t>
+            </w:r>
+            <w:proofErr w:type="spellEnd"/>
+            <w:r>
+              <w:t xml:space="preserve">, </w:t>
+            </w:r>
+            <w:proofErr w:type="spellStart"/>
+            <w:r>
+              <w:t>consectetur</w:t>
+            </w:r>
+            <w:proofErr w:type="spellEnd"/>
+            <w:r>
+              <w:t xml:space="preserve"> </w:t>
+            </w:r>
+            <w:proofErr w:type="spellStart"/>
+            <w:r>
+              <w:t>adipiscing</w:t>
+            </w:r>
+            <w:proofErr w:type="spellEnd"/>
+            <w:r>
+              <w:t xml:space="preserve"> </w:t>
+            </w:r>
+            <w:proofErr w:type="spellStart"/>
+            <w:r>
+              <w:t>elit</w:t>
+            </w:r>
+            <w:proofErr w:type="spellEnd"/>
+            <w:r>
+              <w:t xml:space="preserve">, sed do </w:t>
+            </w:r>
+            <w:proofErr w:type="spellStart"/>
+            <w:r>
+              <w:t>eiusmod</w:t>
+            </w:r>
+            <w:proofErr w:type="spellEnd"/>
+            <w:r>
+              <w:t xml:space="preserve"> </w:t>
+            </w:r>
+            <w:proofErr w:type="spellStart"/>
+            <w:r>
+              <w:t>tempor</w:t>
+            </w:r>
+            <w:proofErr w:type="spellEnd"/>
+            <w:r>
+              <w:t xml:space="preserve"> </w:t>
+            </w:r>
+            <w:proofErr w:type="spellStart"/>
+            <w:r>
+              <w:t>incididunt</w:t>
+            </w:r>
+            <w:proofErr w:type="spellEnd"/>
+            <w:r>
+              <w:t xml:space="preserve"> </w:t>
+            </w:r>
+            <w:proofErr w:type="spellStart"/>
+            <w:r>
+              <w:t>ut</w:t>
+            </w:r>
+            <w:proofErr w:type="spellEnd"/>
+            <w:r>
+              <w:t xml:space="preserve"> labore et dolore magna </w:t>
+            </w:r>
+            <w:proofErr w:type="spellStart"/>
+            <w:r>
+              <w:t>aliqua</w:t>
+            </w:r>
+            <w:proofErr w:type="spellEnd"/>
+            <w:r>
+              <w:t xml:space="preserve">. </w:t>
+            </w:r>
+          </w:p>
+          <w:p>
+            <w:pPr>
+              <w:pStyle w:val="Heading2"/>
+            </w:pPr>
+            <w:r>
+              <w:t>HEADLINE 2</w:t>
+            </w:r>
+          </w:p>
+          <w:p>
+            <w:r>
+              <w:t xml:space="preserve">Lorem ipsum </w:t>
+            </w:r>
+            <w:proofErr w:type="spellStart"/>
+            <w:r>
+              <w:t>dolor</w:t>
+            </w:r>
+            <w:proofErr w:type="spellEnd"/>
+            <w:r>
+              <w:t xml:space="preserve"> </w:t>
+            </w:r>
+            <w:proofErr w:type="gramStart"/>
+            <w:r>
+              <w:t>sit</w:t>
+            </w:r>
+            <w:proofErr w:type="gramEnd"/>
+            <w:r>
+              <w:t xml:space="preserve"> </w:t>
+            </w:r>
+            <w:proofErr w:type="spellStart"/>
+            <w:r>
+              <w:t>amet</w:t>
+            </w:r>
+            <w:proofErr w:type="spellEnd"/>
+            <w:r>
+              <w:t xml:space="preserve">, </w:t>
+            </w:r>
+            <w:proofErr w:type="spellStart"/>
+            <w:r>
+              <w:t>consectetur</w:t>
+            </w:r>
+            <w:proofErr w:type="spellEnd"/>
+            <w:r>
+              <w:t xml:space="preserve"> </w:t>
+            </w:r>
+            <w:proofErr w:type="spellStart"/>
+            <w:r>
+              <w:t>adipiscing</w:t>
+            </w:r>
+            <w:proofErr w:type="spellEnd"/>
+            <w:r>
+              <w:t xml:space="preserve"> </w:t>
+            </w:r>
+            <w:proofErr w:type="spellStart"/>
+            <w:r>
+              <w:t>elit</w:t>
+            </w:r>
+            <w:proofErr w:type="spellEnd"/>
+            <w:r>
+              <w:t xml:space="preserve">, sed do </w:t>
+            </w:r>
+            <w:proofErr w:type="spellStart"/>
+            <w:r>
+              <w:t>eiusmod</w:t>
+            </w:r>
+            <w:proofErr w:type="spellEnd"/>
+            <w:r>
+              <w:t xml:space="preserve"> </w:t>
+            </w:r>
+            <w:proofErr w:type="spellStart"/>
+            <w:r>
+              <w:t>tempor</w:t>
+            </w:r>
+            <w:proofErr w:type="spellEnd"/>
+            <w:r>
+              <w:t xml:space="preserve"> </w:t>
+            </w:r>
+            <w:proofErr w:type="spellStart"/>
+            <w:r>
+              <w:t>incididunt</w:t>
+            </w:r>
+            <w:proofErr w:type="spellEnd"/>
+            <w:r>
+              <w:t xml:space="preserve"> </w:t>
+            </w:r>
+            <w:proofErr w:type="spellStart"/>
+            <w:r>
+              <w:t>ut</w:t>
+            </w:r>
+            <w:proofErr w:type="spellEnd"/>
+            <w:r>
+              <w:t xml:space="preserve"> labore et dolore magna </w:t>
+            </w:r>
+            <w:proofErr w:type="spellStart"/>
+            <w:r>
+              <w:t>aliqua</w:t>
+            </w:r>
+            <w:proofErr w:type="spellEnd"/>
+            <w:r>
+              <w:t xml:space="preserve">. Ut </w:t>
+            </w:r>
+            <w:proofErr w:type="spellStart"/>
+            <w:r>
+              <w:t>enim</w:t>
+            </w:r>
+            <w:proofErr w:type="spellEnd"/>
+            <w:r>
+              <w:t xml:space="preserve"> ad minim </w:t>
+            </w:r>
+            <w:proofErr w:type="spellStart"/>
+            <w:r>
+              <w:t>veniam</w:t>
+            </w:r>
+            <w:proofErr w:type="spellEnd"/>
+            <w:r>
+              <w:t xml:space="preserve">, </w:t>
+            </w:r>
+            <w:proofErr w:type="spellStart"/>
+            <w:r>
+              <w:t>quis</w:t>
+            </w:r>
+            <w:proofErr w:type="spellEnd"/>
+            <w:r>
+              <w:t xml:space="preserve"> </w:t>
+            </w:r>
+            <w:proofErr w:type="spellStart"/>
+            <w:r>
+              <w:t>nostrud</w:t>
+            </w:r>
+            <w:proofErr w:type="spellEnd"/>
+            <w:r>
+              <w:t xml:space="preserve"> exercitation </w:t>
+            </w:r>
+            <w:proofErr w:type="spellStart"/>
+            <w:r>
+              <w:t>ullamco</w:t>
+            </w:r>
+            <w:proofErr w:type="spellEnd"/>
+            <w:r>
+              <w:t xml:space="preserve"> </w:t>
+            </w:r>
+            <w:proofErr w:type="spellStart"/>
+            <w:r>
+              <w:t>laboris</w:t>
+            </w:r>
+            <w:proofErr w:type="spellEnd"/>
+            <w:r>
+              <w:t xml:space="preserve"> nisi </w:t>
+            </w:r>
+            <w:proofErr w:type="spellStart"/>
+            <w:r>
+              <w:t>ut</w:t>
+            </w:r>
+            <w:proofErr w:type="spellEnd"/>
+            <w:r>
+              <w:t xml:space="preserve"> </w:t>
+            </w:r>
+            <w:proofErr w:type="spellStart"/>
+            <w:r>
+              <w:t>aliquip</w:t>
+            </w:r>
+            <w:proofErr w:type="spellEnd"/>
+            <w:r>
+              <w:t xml:space="preserve"> ex </w:t>
+            </w:r>
+            <w:proofErr w:type="spellStart"/>
+            <w:r>
+              <w:t>ea</w:t>
+            </w:r>
+            <w:proofErr w:type="spellEnd"/>
+            <w:r>
+              <w:t xml:space="preserve"> </w:t>
+            </w:r>
+            <w:proofErr w:type="spellStart"/>
+            <w:r>
+              <w:t>commodo</w:t>
+            </w:r>
+            <w:proofErr w:type="spellEnd"/>
+            <w:r>
+              <w:t xml:space="preserve"> </w:t>
+            </w:r>
+            <w:proofErr w:type="spellStart"/>
+            <w:r>
+              <w:t>consequat</w:t>
+            </w:r>
+            <w:proofErr w:type="spellEnd"/>
+            <w:r>
+              <w:t xml:space="preserve">. Duis </w:t>
+            </w:r>
+            <w:proofErr w:type="spellStart"/>
+            <w:r>
+              <w:t>aute</w:t>
+            </w:r>
+            <w:proofErr w:type="spellEnd"/>
+            <w:r>
+              <w:t xml:space="preserve"> </w:t>
+            </w:r>
+            <w:proofErr w:type="spellStart"/>
+            <w:r>
+              <w:t>irure</w:t>
+            </w:r>
+            <w:proofErr w:type="spellEnd"/>
+            <w:r>
+              <w:t xml:space="preserve"> </w:t>
+            </w:r>
+            <w:proofErr w:type="spellStart"/>
+            <w:r>
+              <w:t>dolor</w:t>
+            </w:r>
+            <w:proofErr w:type="spellEnd"/>
+            <w:r>
+              <w:t xml:space="preserve"> in </w:t>
+            </w:r>
+          </w:p>
+          <w:p/>
+          <w:p/>
+          <w:p>
+            <w:pPr>
+              <w:jc w:val="center"/>
+              <w:rPr>
+                <w:b/>
+                <w:bCs/>
+                <w:u w:val="single"/>
+              </w:rPr>
+            </w:pPr>
+            <w:r>
+              <w:rPr>
+                <w:b/>
+                <w:bCs/>
+                <w:sz w:val="32"/>
+                <w:szCs w:val="32"/>
+                <w:u w:val="single"/>
+              </w:rPr>
+              <w:t>Exit to Desktop</w:t>
+            </w:r>
+          </w:p>
+        </w:tc>
+        <w:tc>
+          <w:tcPr>
+            <w:tcW w:w="2835" w:type="dxa"/>
+            <w:vMerge w:val="restart"/>
+            <w:tcBorders>
+              <w:top w:val="single" w:sz="4" w:space="0" w:color="auto"/>
+              <w:left w:val="single" w:sz="4" w:space="0" w:color="auto"/>
+              <w:right w:val="single" w:sz="4" w:space="0" w:color="auto"/>
+            </w:tcBorders>
+          </w:tcPr>
+          <w:p>
+            <w:pPr>
+              <w:pStyle w:val="Heading2"/>
+            </w:pPr>
+          </w:p>
+          <w:p/>
+          <w:p/>
+          <w:p/>
+          <w:p>
+            <w:pPr>
+              <w:pStyle w:val="Heading2"/>
+            </w:pPr>
+            <w:r>
+              <w:t>About / Credits</w:t>
+            </w:r>
+          </w:p>
+          <w:p>
+            <w:r>
+              <w:t xml:space="preserve">Lorem ipsum </w:t>
+            </w:r>
+            <w:proofErr w:type="spellStart"/>
+            <w:r>
+              <w:t>dolor</w:t>
+            </w:r>
+            <w:proofErr w:type="spellEnd"/>
+            <w:r>
+              <w:t xml:space="preserve"> </w:t>
+            </w:r>
+            <w:proofErr w:type="gramStart"/>
+            <w:r>
+              <w:t>sit</w:t>
+            </w:r>
+            <w:proofErr w:type="gramEnd"/>
+            <w:r>
+              <w:t xml:space="preserve"> </w:t>
+            </w:r>
+            <w:proofErr w:type="spellStart"/>
+            <w:r>
+              <w:t>amet</w:t>
+            </w:r>
+            <w:proofErr w:type="spellEnd"/>
+            <w:r>
+              <w:t xml:space="preserve">, </w:t>
+            </w:r>
+            <w:proofErr w:type="spellStart"/>
+            <w:r>
+              <w:t>consectetur</w:t>
+            </w:r>
+            <w:proofErr w:type="spellEnd"/>
+            <w:r>
+              <w:t xml:space="preserve"> </w:t>
+            </w:r>
+            <w:proofErr w:type="spellStart"/>
+            <w:r>
+              <w:t>adipiscing</w:t>
+            </w:r>
+            <w:proofErr w:type="spellEnd"/>
+            <w:r>
+              <w:t xml:space="preserve"> </w:t>
+            </w:r>
+            <w:proofErr w:type="spellStart"/>
+            <w:r>
+              <w:t>elit</w:t>
+            </w:r>
+            <w:proofErr w:type="spellEnd"/>
+            <w:r>
+              <w:t xml:space="preserve">, sed do </w:t>
+            </w:r>
+            <w:proofErr w:type="spellStart"/>
+            <w:r>
+              <w:t>eiusmod</w:t>
+            </w:r>
+            <w:proofErr w:type="spellEnd"/>
+            <w:r>
+              <w:t xml:space="preserve"> </w:t>
+            </w:r>
+            <w:proofErr w:type="spellStart"/>
+            <w:r>
+              <w:t>tempor</w:t>
+            </w:r>
+            <w:proofErr w:type="spellEnd"/>
+            <w:r>
+              <w:t xml:space="preserve"> </w:t>
+            </w:r>
+            <w:proofErr w:type="spellStart"/>
+            <w:r>
+              <w:t>incididunt</w:t>
+            </w:r>
+            <w:proofErr w:type="spellEnd"/>
+            <w:r>
+              <w:t xml:space="preserve"> </w:t>
+            </w:r>
+            <w:proofErr w:type="spellStart"/>
+            <w:r>
+              <w:t>ut</w:t>
+            </w:r>
+            <w:proofErr w:type="spellEnd"/>
+            <w:r>
+              <w:t xml:space="preserve"> labore et dolore magna </w:t>
+            </w:r>
+            <w:proofErr w:type="spellStart"/>
+            <w:r>
+              <w:t>aliqua</w:t>
+            </w:r>
+            <w:proofErr w:type="spellEnd"/>
+            <w:r>
+              <w:t xml:space="preserve">. Ut </w:t>
+            </w:r>
+            <w:proofErr w:type="spellStart"/>
+            <w:r>
+              <w:t>enim</w:t>
+            </w:r>
+            <w:proofErr w:type="spellEnd"/>
+            <w:r>
+              <w:t xml:space="preserve"> ad minim </w:t>
+            </w:r>
+            <w:proofErr w:type="spellStart"/>
+            <w:r>
+              <w:t>veniam</w:t>
+            </w:r>
+            <w:proofErr w:type="spellEnd"/>
+            <w:r>
+              <w:t xml:space="preserve">, </w:t>
+            </w:r>
+            <w:proofErr w:type="spellStart"/>
+            <w:r>
+              <w:t>quis</w:t>
+            </w:r>
+            <w:proofErr w:type="spellEnd"/>
+            <w:r>
+              <w:t xml:space="preserve"> </w:t>
+            </w:r>
+            <w:proofErr w:type="spellStart"/>
+            <w:r>
+              <w:t>nostrud</w:t>
+            </w:r>
+            <w:proofErr w:type="spellEnd"/>
+            <w:r>
+              <w:t xml:space="preserve"> exercitation </w:t>
+            </w:r>
+            <w:proofErr w:type="spellStart"/>
+            <w:r>
+              <w:t>ullamco</w:t>
+            </w:r>
+            <w:proofErr w:type="spellEnd"/>
+            <w:r>
+              <w:t xml:space="preserve"> </w:t>
+            </w:r>
+            <w:proofErr w:type="spellStart"/>
+            <w:r>
+              <w:t>laboris</w:t>
+            </w:r>
+            <w:proofErr w:type="spellEnd"/>
+            <w:r>
+              <w:t xml:space="preserve"> nisi </w:t>
+            </w:r>
+            <w:proofErr w:type="spellStart"/>
+            <w:r>
+              <w:t>ut</w:t>
+            </w:r>
+            <w:proofErr w:type="spellEnd"/>
+            <w:r>
+              <w:t xml:space="preserve"> </w:t>
+            </w:r>
+            <w:proofErr w:type="spellStart"/>
+            <w:r>
+              <w:t>aliquip</w:t>
+            </w:r>
+            <w:proofErr w:type="spellEnd"/>
+            <w:r>
+              <w:t xml:space="preserve"> ex </w:t>
+            </w:r>
+            <w:proofErr w:type="spellStart"/>
+            <w:r>
+              <w:t>ea</w:t>
+            </w:r>
+            <w:proofErr w:type="spellEnd"/>
+            <w:r>
+              <w:t xml:space="preserve"> </w:t>
+            </w:r>
+            <w:proofErr w:type="spellStart"/>
+            <w:r>
+              <w:t>commodo</w:t>
+            </w:r>
+            <w:proofErr w:type="spellEnd"/>
+            <w:r>
+              <w:t xml:space="preserve"> </w:t>
+            </w:r>
+            <w:proofErr w:type="spellStart"/>
+            <w:r>
+              <w:t>consequat</w:t>
+            </w:r>
+            <w:proofErr w:type="spellEnd"/>
+            <w:r>
+              <w:t>.</w:t>
+            </w:r>
+          </w:p>
+          <w:p>
+            <w:r>
+              <w:t xml:space="preserve">Lorem ipsum </w:t>
+            </w:r>
+            <w:proofErr w:type="spellStart"/>
+            <w:r>
+              <w:t>dolor</w:t>
+            </w:r>
+            <w:proofErr w:type="spellEnd"/>
+            <w:r>
+              <w:t xml:space="preserve"> </w:t>
+            </w:r>
+            <w:proofErr w:type="gramStart"/>
+            <w:r>
+              <w:t>sit</w:t>
+            </w:r>
+            <w:proofErr w:type="gramEnd"/>
+            <w:r>
+              <w:t xml:space="preserve"> </w:t>
+            </w:r>
+            <w:proofErr w:type="spellStart"/>
+            <w:r>
+              <w:t>amet</w:t>
+            </w:r>
+            <w:proofErr w:type="spellEnd"/>
+            <w:r>
+              <w:t xml:space="preserve">, labore et dolore magna </w:t>
+            </w:r>
+            <w:proofErr w:type="spellStart"/>
+            <w:r>
+              <w:t>aliqua</w:t>
+            </w:r>
+            <w:proofErr w:type="spellEnd"/>
+            <w:r>
+              <w:t xml:space="preserve">. </w:t>
+            </w:r>
+          </w:p>
+          <w:p>
+            <w:pPr>
+              <w:pStyle w:val="Heading2"/>
+            </w:pPr>
+            <w:r>
+              <w:t>SEND ME A MESSAGE!</w:t>
+            </w:r>
+          </w:p>
+          <w:p>
+            <w:r>
+              <w:t>Have ideas for features? Do you want to see this game further developed? Chuck me a message through the feedback form.</w:t>
+            </w:r>
+          </w:p>
+        </w:tc>
+        <w:tc>
+          <w:tcPr>
+            <w:tcW w:w="2835" w:type="dxa"/>
+            <w:vMerge w:val="restart"/>
+            <w:tcBorders>
+              <w:top w:val="single" w:sz="4" w:space="0" w:color="auto"/>
+              <w:left w:val="single" w:sz="4" w:space="0" w:color="auto"/>
+              <w:right w:val="single" w:sz="4" w:space="0" w:color="auto"/>
+            </w:tcBorders>
+          </w:tcPr>
+          <w:p>
+            <w:pPr>
+              <w:pStyle w:val="Heading2"/>
+            </w:pPr>
+            <w:r>
+              <w:t>Party Members</w:t>
+            </w:r>
+          </w:p>
+          <w:p>
+            <w:r>
+              <w:t xml:space="preserve">Lorem ipsum </w:t>
+            </w:r>
+            <w:proofErr w:type="spellStart"/>
+            <w:r>
+              <w:t>dolor</w:t>
+            </w:r>
+            <w:proofErr w:type="spellEnd"/>
+            <w:r>
+              <w:t xml:space="preserve"> </w:t>
+            </w:r>
+            <w:proofErr w:type="gramStart"/>
+            <w:r>
+              <w:t>sit</w:t>
+            </w:r>
+            <w:proofErr w:type="gramEnd"/>
+            <w:r>
+              <w:t xml:space="preserve"> </w:t>
+            </w:r>
+            <w:proofErr w:type="spellStart"/>
+            <w:r>
+              <w:t>amet</w:t>
+            </w:r>
+            <w:proofErr w:type="spellEnd"/>
+            <w:r>
+              <w:t xml:space="preserve">, </w:t>
+            </w:r>
+            <w:proofErr w:type="spellStart"/>
+            <w:r>
+              <w:t>consectetur</w:t>
+            </w:r>
+            <w:proofErr w:type="spellEnd"/>
+            <w:r>
+              <w:t xml:space="preserve"> </w:t>
+            </w:r>
+            <w:proofErr w:type="spellStart"/>
+            <w:r>
+              <w:t>adipiscing</w:t>
+            </w:r>
+            <w:proofErr w:type="spellEnd"/>
+            <w:r>
+              <w:t xml:space="preserve"> </w:t>
+            </w:r>
+            <w:proofErr w:type="spellStart"/>
+            <w:r>
+              <w:t>elit</w:t>
+            </w:r>
+            <w:proofErr w:type="spellEnd"/>
+            <w:r>
+              <w:t xml:space="preserve">, sed do </w:t>
+            </w:r>
+            <w:proofErr w:type="spellStart"/>
+            <w:r>
+              <w:t>eiusmod</w:t>
+            </w:r>
+            <w:proofErr w:type="spellEnd"/>
+            <w:r>
+              <w:t xml:space="preserve"> </w:t>
+            </w:r>
+            <w:proofErr w:type="spellStart"/>
+            <w:r>
+              <w:t>tempor</w:t>
+            </w:r>
+            <w:proofErr w:type="spellEnd"/>
+            <w:r>
+              <w:t xml:space="preserve"> </w:t>
+            </w:r>
+            <w:proofErr w:type="spellStart"/>
+            <w:r>
+              <w:t>incididunt</w:t>
+            </w:r>
+            <w:proofErr w:type="spellEnd"/>
+            <w:r>
+              <w:t xml:space="preserve"> </w:t>
+            </w:r>
+            <w:proofErr w:type="spellStart"/>
+            <w:r>
+              <w:t>ut</w:t>
+            </w:r>
+            <w:proofErr w:type="spellEnd"/>
+            <w:r>
+              <w:t xml:space="preserve"> labore et dolore magna </w:t>
+            </w:r>
+            <w:proofErr w:type="spellStart"/>
+            <w:r>
+              <w:t>aliqua</w:t>
+            </w:r>
+            <w:proofErr w:type="spellEnd"/>
+            <w:r>
+              <w:t xml:space="preserve">. Ut </w:t>
+            </w:r>
+            <w:proofErr w:type="spellStart"/>
+            <w:r>
+              <w:t>enim</w:t>
+            </w:r>
+            <w:proofErr w:type="spellEnd"/>
+            <w:r>
+              <w:t xml:space="preserve"> ad minim </w:t>
+            </w:r>
+            <w:proofErr w:type="spellStart"/>
+            <w:r>
+              <w:t>veniam</w:t>
+            </w:r>
+            <w:proofErr w:type="spellEnd"/>
+            <w:r>
+              <w:t xml:space="preserve">, </w:t>
+            </w:r>
+            <w:proofErr w:type="spellStart"/>
+            <w:r>
+              <w:t>quis</w:t>
+            </w:r>
+            <w:proofErr w:type="spellEnd"/>
+            <w:r>
+              <w:t xml:space="preserve"> </w:t>
+            </w:r>
+            <w:proofErr w:type="spellStart"/>
+            <w:r>
+              <w:t>nostrud</w:t>
+            </w:r>
+            <w:proofErr w:type="spellEnd"/>
+            <w:r>
+              <w:t xml:space="preserve"> exercitation </w:t>
+            </w:r>
+            <w:proofErr w:type="spellStart"/>
+            <w:r>
+              <w:t>ullamco</w:t>
+            </w:r>
+            <w:proofErr w:type="spellEnd"/>
+            <w:r>
+              <w:t xml:space="preserve"> </w:t>
+            </w:r>
+            <w:proofErr w:type="spellStart"/>
+            <w:r>
+              <w:t>laboris</w:t>
+            </w:r>
+            <w:proofErr w:type="spellEnd"/>
+            <w:r>
+              <w:t xml:space="preserve"> nisi </w:t>
+            </w:r>
+            <w:proofErr w:type="spellStart"/>
+            <w:r>
+              <w:t>ut</w:t>
+            </w:r>
+            <w:proofErr w:type="spellEnd"/>
+            <w:r>
+              <w:t xml:space="preserve"> </w:t>
+            </w:r>
+            <w:proofErr w:type="spellStart"/>
+            <w:r>
+              <w:t>aliquip</w:t>
+            </w:r>
+            <w:proofErr w:type="spellEnd"/>
+            <w:r>
+              <w:t xml:space="preserve"> ex </w:t>
+            </w:r>
+            <w:proofErr w:type="spellStart"/>
+            <w:r>
+              <w:t>ea</w:t>
+            </w:r>
+            <w:proofErr w:type="spellEnd"/>
+            <w:r>
+              <w:t xml:space="preserve"> </w:t>
+            </w:r>
+            <w:proofErr w:type="spellStart"/>
+            <w:r>
+              <w:t>commodo</w:t>
+            </w:r>
+            <w:proofErr w:type="spellEnd"/>
+            <w:r>
+              <w:t xml:space="preserve"> </w:t>
+            </w:r>
+            <w:proofErr w:type="spellStart"/>
+            <w:r>
+              <w:t>consequat</w:t>
+            </w:r>
+            <w:proofErr w:type="spellEnd"/>
+            <w:r>
+              <w:t>.</w:t>
+            </w:r>
+          </w:p>
+          <w:p>
+            <w:r>
+              <w:t>HEADLINE 1</w:t>
+            </w:r>
+          </w:p>
+          <w:p>
+            <w:r>
+              <w:t xml:space="preserve">Lorem ipsum </w:t>
+            </w:r>
+            <w:proofErr w:type="spellStart"/>
+            <w:r>
+              <w:t>dolor</w:t>
+            </w:r>
+            <w:proofErr w:type="spellEnd"/>
+            <w:r>
+              <w:t xml:space="preserve"> </w:t>
+            </w:r>
+            <w:proofErr w:type="gramStart"/>
+            <w:r>
+              <w:t>sit</w:t>
+            </w:r>
+            <w:proofErr w:type="gramEnd"/>
+            <w:r>
+              <w:t xml:space="preserve"> </w:t>
+            </w:r>
+            <w:proofErr w:type="spellStart"/>
+            <w:r>
+              <w:t>amet</w:t>
+            </w:r>
+            <w:proofErr w:type="spellEnd"/>
+            <w:r>
+              <w:t xml:space="preserve">, </w:t>
+            </w:r>
+            <w:proofErr w:type="spellStart"/>
+            <w:r>
+              <w:t>consectetur</w:t>
+            </w:r>
+            <w:proofErr w:type="spellEnd"/>
+            <w:r>
+              <w:t xml:space="preserve"> </w:t>
+            </w:r>
+            <w:proofErr w:type="spellStart"/>
+            <w:r>
+              <w:t>adipiscing</w:t>
+            </w:r>
+            <w:proofErr w:type="spellEnd"/>
+            <w:r>
+              <w:t xml:space="preserve"> </w:t>
+            </w:r>
+            <w:proofErr w:type="spellStart"/>
+            <w:r>
+              <w:t>elit</w:t>
+            </w:r>
+            <w:proofErr w:type="spellEnd"/>
+            <w:r>
+              <w:t xml:space="preserve">, sed do </w:t>
+            </w:r>
+            <w:proofErr w:type="spellStart"/>
+            <w:r>
+              <w:t>eiusmod</w:t>
+            </w:r>
+            <w:proofErr w:type="spellEnd"/>
+            <w:r>
+              <w:t xml:space="preserve"> </w:t>
+            </w:r>
+            <w:proofErr w:type="spellStart"/>
+            <w:r>
+              <w:t>tempor</w:t>
+            </w:r>
+            <w:proofErr w:type="spellEnd"/>
+            <w:r>
+              <w:t xml:space="preserve"> </w:t>
+            </w:r>
+            <w:proofErr w:type="spellStart"/>
+            <w:r>
+              <w:t>incididunt</w:t>
+            </w:r>
+            <w:proofErr w:type="spellEnd"/>
+            <w:r>
+              <w:t xml:space="preserve"> </w:t>
+            </w:r>
+            <w:proofErr w:type="spellStart"/>
+            <w:r>
+              <w:t>ut</w:t>
+            </w:r>
+            <w:proofErr w:type="spellEnd"/>
+            <w:r>
+              <w:t xml:space="preserve"> labore et dolore magna</w:t>
+            </w:r>
+          </w:p>
+          <w:p>
+            <w:pPr>
+              <w:pStyle w:val="Heading2"/>
+            </w:pPr>
+            <w:r>
+              <w:t>HEADLINE 6</w:t>
+            </w:r>
+          </w:p>
+          <w:p>
+            <w:r>
+              <w:t xml:space="preserve">Lorem ipsum </w:t>
+            </w:r>
+            <w:proofErr w:type="spellStart"/>
+            <w:r>
+              <w:t>dolor</w:t>
+            </w:r>
+            <w:proofErr w:type="spellEnd"/>
+            <w:r>
+              <w:t xml:space="preserve"> </w:t>
+            </w:r>
+            <w:proofErr w:type="gramStart"/>
+            <w:r>
+              <w:t>sit</w:t>
+            </w:r>
+            <w:proofErr w:type="gramEnd"/>
+            <w:r>
+              <w:t xml:space="preserve"> </w:t>
+            </w:r>
+            <w:proofErr w:type="spellStart"/>
+            <w:r>
+              <w:t>amet</w:t>
+            </w:r>
+            <w:proofErr w:type="spellEnd"/>
+            <w:r>
+              <w:t xml:space="preserve">, </w:t>
+            </w:r>
+            <w:proofErr w:type="spellStart"/>
+            <w:r>
+              <w:t>consectetur</w:t>
+            </w:r>
+            <w:proofErr w:type="spellEnd"/>
+            <w:r>
+              <w:t xml:space="preserve"> </w:t>
+            </w:r>
+            <w:proofErr w:type="spellStart"/>
+            <w:r>
+              <w:t>adipiscing</w:t>
+            </w:r>
+            <w:proofErr w:type="spellEnd"/>
+            <w:r>
+              <w:t xml:space="preserve"> </w:t>
+            </w:r>
+            <w:proofErr w:type="spellStart"/>
+            <w:r>
+              <w:t>elit</w:t>
+            </w:r>
+            <w:proofErr w:type="spellEnd"/>
+            <w:r>
+              <w:t xml:space="preserve">, sed do </w:t>
+            </w:r>
+            <w:proofErr w:type="spellStart"/>
+            <w:r>
+              <w:t>eiusmod</w:t>
+            </w:r>
+            <w:proofErr w:type="spellEnd"/>
+            <w:r>
+              <w:t xml:space="preserve"> </w:t>
+            </w:r>
+            <w:proofErr w:type="spellStart"/>
+            <w:r>
+              <w:t>tempor</w:t>
+            </w:r>
+            <w:proofErr w:type="spellEnd"/>
+            <w:r>
+              <w:t xml:space="preserve"> </w:t>
+            </w:r>
+            <w:proofErr w:type="spellStart"/>
+            <w:r>
+              <w:t>incididunt</w:t>
+            </w:r>
+            <w:proofErr w:type="spellEnd"/>
+            <w:r>
+              <w:t xml:space="preserve"> </w:t>
+            </w:r>
+            <w:proofErr w:type="spellStart"/>
+            <w:r>
+              <w:t>ut</w:t>
+            </w:r>
+            <w:proofErr w:type="spellEnd"/>
+            <w:r>
+              <w:t xml:space="preserve"> labore et </w:t>
+            </w:r>
+            <w:proofErr w:type="spellStart"/>
+            <w:r>
+              <w:t>ullamco</w:t>
+            </w:r>
+            <w:proofErr w:type="spellEnd"/>
+            <w:r>
+              <w:t xml:space="preserve"> </w:t>
+            </w:r>
+            <w:proofErr w:type="spellStart"/>
+            <w:r>
+              <w:t>laboris</w:t>
+            </w:r>
+            <w:proofErr w:type="spellEnd"/>
+            <w:r>
+              <w:t xml:space="preserve"> nisi </w:t>
+            </w:r>
+            <w:proofErr w:type="spellStart"/>
+            <w:r>
+              <w:t>ut</w:t>
+            </w:r>
+            <w:proofErr w:type="spellEnd"/>
+            <w:r>
+              <w:t xml:space="preserve"> </w:t>
+            </w:r>
+            <w:proofErr w:type="spellStart"/>
+            <w:r>
+              <w:t>aliquip</w:t>
+            </w:r>
+            <w:proofErr w:type="spellEnd"/>
+            <w:r>
+              <w:t xml:space="preserve"> ex ea</w:t>
+            </w:r>
+            <w:r>
+              <w:t xml:space="preserve">. </w:t>
+            </w:r>
+            <w:proofErr w:type="spellStart"/>
+            <w:r>
+              <w:t>ullamco</w:t>
+            </w:r>
+            <w:proofErr w:type="spellEnd"/>
+            <w:r>
+              <w:t xml:space="preserve"> </w:t>
+            </w:r>
+            <w:proofErr w:type="spellStart"/>
+            <w:r>
+              <w:t>laboris</w:t>
+            </w:r>
+            <w:proofErr w:type="spellEnd"/>
+            <w:r>
+              <w:t xml:space="preserve"> nisi </w:t>
+            </w:r>
+            <w:proofErr w:type="spellStart"/>
+            <w:r>
+              <w:t>ut</w:t>
+            </w:r>
+            <w:proofErr w:type="spellEnd"/>
+            <w:r>
+              <w:t xml:space="preserve"> </w:t>
+            </w:r>
+            <w:proofErr w:type="spellStart"/>
+            <w:r>
+              <w:t>aliquip</w:t>
+            </w:r>
+            <w:proofErr w:type="spellEnd"/>
+            <w:r>
+              <w:t xml:space="preserve"> ex ea</w:t>
+            </w:r>
+            <w:r>
+              <w:t>.</w:t>
+            </w:r>
+            <w:r>
+              <w:t xml:space="preserve"> </w:t>
+            </w:r>
+            <w:proofErr w:type="spellStart"/>
+            <w:r>
+              <w:t>ullamco</w:t>
+            </w:r>
+            <w:proofErr w:type="spellEnd"/>
+            <w:r>
+              <w:t xml:space="preserve"> </w:t>
+            </w:r>
+            <w:proofErr w:type="spellStart"/>
+            <w:r>
+              <w:t>laboris</w:t>
+            </w:r>
+            <w:proofErr w:type="spellEnd"/>
+            <w:r>
+              <w:t xml:space="preserve"> nisi </w:t>
+            </w:r>
+            <w:proofErr w:type="spellStart"/>
+            <w:proofErr w:type="gramStart"/>
+            <w:r>
+              <w:t>ut</w:t>
+            </w:r>
+            <w:proofErr w:type="spellEnd"/>
+            <w:r>
+              <w:t xml:space="preserve"> </w:t>
+            </w:r>
+            <w:r>
+              <w:t>.</w:t>
+            </w:r>
+            <w:proofErr w:type="gramEnd"/>
+          </w:p>
+        </w:tc>
+        <w:tc>
+          <w:tcPr>
+            <w:tcW w:w="2835" w:type="dxa"/>
+            <w:tcBorders>
+              <w:top w:val="single" w:sz="4" w:space="0" w:color="auto"/>
+              <w:left w:val="single" w:sz="4" w:space="0" w:color="auto"/>
+            </w:tcBorders>
+          </w:tcPr>
+          <w:p>
+            <w:pPr>
+              <w:pStyle w:val="Heading2"/>
+            </w:pPr>
+            <w:r>
+              <w:t>Mode</w:t>
+            </w:r>
+          </w:p>
+          <w:p>
+            <w:r>
+              <w:t xml:space="preserve">Lorem ipsum </w:t>
+            </w:r>
+            <w:proofErr w:type="spellStart"/>
+            <w:r>
+              <w:t>dolor</w:t>
+            </w:r>
+            <w:proofErr w:type="spellEnd"/>
+            <w:r>
+              <w:t xml:space="preserve"> </w:t>
+            </w:r>
+            <w:proofErr w:type="gramStart"/>
+            <w:r>
+              <w:t>sit</w:t>
+            </w:r>
+            <w:proofErr w:type="gramEnd"/>
+            <w:r>
+              <w:t xml:space="preserve"> </w:t>
+            </w:r>
+            <w:proofErr w:type="spellStart"/>
+            <w:r>
+              <w:t>amet</w:t>
+            </w:r>
+            <w:proofErr w:type="spellEnd"/>
+            <w:r>
+              <w:t xml:space="preserve">, </w:t>
+            </w:r>
+            <w:proofErr w:type="spellStart"/>
+            <w:r>
+              <w:t>consectetur</w:t>
+            </w:r>
+            <w:proofErr w:type="spellEnd"/>
+            <w:r>
+              <w:t xml:space="preserve"> </w:t>
+            </w:r>
+            <w:proofErr w:type="spellStart"/>
+            <w:r>
+              <w:t>adipiscing</w:t>
+            </w:r>
+            <w:proofErr w:type="spellEnd"/>
+            <w:r>
+              <w:t xml:space="preserve"> </w:t>
+            </w:r>
+            <w:proofErr w:type="spellStart"/>
+            <w:r>
+              <w:t>elit</w:t>
+            </w:r>
+            <w:proofErr w:type="spellEnd"/>
+            <w:r>
+              <w:t xml:space="preserve">, sed do </w:t>
+            </w:r>
+            <w:proofErr w:type="spellStart"/>
+            <w:r>
+              <w:t>eiusmod</w:t>
+            </w:r>
+            <w:proofErr w:type="spellEnd"/>
+            <w:r>
+              <w:t xml:space="preserve"> </w:t>
+            </w:r>
+            <w:proofErr w:type="spellStart"/>
+            <w:r>
+              <w:t>tempor</w:t>
+            </w:r>
+            <w:proofErr w:type="spellEnd"/>
+          </w:p>
+          <w:p>
+            <w:pPr>
+              <w:pStyle w:val="Heading2"/>
+            </w:pPr>
+            <w:r>
+              <w:t>VOLUNTEERS WANTED</w:t>
+            </w:r>
+          </w:p>
+          <w:p>
+            <w:r>
+              <w:t xml:space="preserve">Under the leadership of </w:t>
+            </w:r>
+            <w:r>
+              <w:t xml:space="preserve">Major </w:t>
+            </w:r>
+            <w:proofErr w:type="spellStart"/>
+            <w:r>
+              <w:t>Gwynydd</w:t>
+            </w:r>
+            <w:proofErr w:type="spellEnd"/>
+            <w:r>
+              <w:t xml:space="preserve"> Purves Wynne-Aubrey Meredith</w:t>
+            </w:r>
+            <w:r>
+              <w:t>, the Royal Australian Artillery are looking for keen young soldiers to join the ranks of the 7</w:t>
+            </w:r>
+            <w:r>
+              <w:t>th</w:t>
+            </w:r>
+            <w:r>
+              <w:t xml:space="preserve"> Heavy </w:t>
+            </w:r>
+            <w:r>
+              <w:t>Artillery division.</w:t>
+            </w:r>
+          </w:p>
+          <w:p/>
+        </w:tc>
+      </w:tr>
+      <w:tr>
+        <w:trPr>
+          <w:trHeight w:val="2673"/>
+        </w:trPr>
+        <w:tc>
+          <w:tcPr>
+            <w:tcW w:w="2835" w:type="dxa"/>
+            <w:vMerge/>
+            <w:tcBorders>
+              <w:right w:val="single" w:sz="4" w:space="0" w:color="auto"/>
+            </w:tcBorders>
+          </w:tcPr>
+          <w:p/>
+        </w:tc>
+        <w:tc>
+          <w:tcPr>
+            <w:tcW w:w="2835" w:type="dxa"/>
+            <w:vMerge/>
+            <w:tcBorders>
+              <w:left w:val="single" w:sz="4" w:space="0" w:color="auto"/>
+              <w:right w:val="single" w:sz="4" w:space="0" w:color="auto"/>
+            </w:tcBorders>
+          </w:tcPr>
+          <w:p/>
+        </w:tc>
+        <w:tc>
+          <w:tcPr>
+            <w:tcW w:w="2835" w:type="dxa"/>
+            <w:vMerge/>
+            <w:tcBorders>
+              <w:left w:val="single" w:sz="4" w:space="0" w:color="auto"/>
+              <w:right w:val="single" w:sz="4" w:space="0" w:color="auto"/>
+            </w:tcBorders>
+          </w:tcPr>
+          <w:p/>
+        </w:tc>
+        <w:tc>
+          <w:tcPr>
+            <w:tcW w:w="2835" w:type="dxa"/>
+            <w:tcBorders>
+              <w:left w:val="single" w:sz="4" w:space="0" w:color="auto"/>
+            </w:tcBorders>
+          </w:tcPr>
+          <w:p>
+            <w:pPr>
+              <w:jc w:val="center"/>
+              <w:rPr>
+                <w:u w:val="single"/>
+              </w:rPr>
+            </w:pPr>
+          </w:p>
+          <w:p>
+            <w:pPr>
+              <w:jc w:val="center"/>
+              <w:rPr>
+                <w:u w:val="single"/>
+              </w:rPr>
+            </w:pPr>
+          </w:p>
+          <w:p>
+            <w:pPr>
+              <w:jc w:val="center"/>
+              <w:rPr>
+                <w:u w:val="single"/>
+              </w:rPr>
+            </w:pPr>
+          </w:p>
+          <w:p>
+            <w:pPr>
+              <w:jc w:val="center"/>
+              <w:rPr>
+                <w:b/>
+                <w:bCs/>
+                <w:sz w:val="72"/>
+                <w:szCs w:val="72"/>
+                <w:u w:val="single"/>
+              </w:rPr>
+            </w:pPr>
+            <w:r>
+              <w:rPr>
+                <w:b/>
+                <w:bCs/>
+                <w:sz w:val="72"/>
+                <w:szCs w:val="72"/>
+                <w:u w:val="single"/>
+              </w:rPr>
+              <w:t>DEPLOY NOW</w:t>
+            </w:r>
+          </w:p>
+          <w:p>
+            <w:pPr>
+              <w:jc w:val="center"/>
+              <w:rPr>
+                <w:u w:val="single"/>
+              </w:rPr>
+            </w:pPr>
+          </w:p>
+          <w:p>
+            <w:pPr>
+              <w:jc w:val="center"/>
+              <w:rPr>
+                <w:u w:val="single"/>
+              </w:rPr>
+            </w:pPr>
+          </w:p>
+          <w:p>
+            <w:pPr>
+              <w:jc w:val="center"/>
+            </w:pPr>
+          </w:p>
+        </w:tc>
+      </w:tr>
+      <w:tr>
+        <w:trPr>
+          <w:trHeight w:val="506"/>
+        </w:trPr>
+        <w:tc>
+          <w:tcPr>
+            <w:tcW w:w="2835" w:type="dxa"/>
+            <w:vMerge/>
+            <w:tcBorders>
+              <w:right w:val="single" w:sz="4" w:space="0" w:color="auto"/>
+            </w:tcBorders>
+          </w:tcPr>
+          <w:p/>
+        </w:tc>
+        <w:tc>
+          <w:tcPr>
+            <w:tcW w:w="2835" w:type="dxa"/>
+            <w:vMerge/>
+            <w:tcBorders>
+              <w:left w:val="single" w:sz="4" w:space="0" w:color="auto"/>
+              <w:right w:val="single" w:sz="4" w:space="0" w:color="auto"/>
+            </w:tcBorders>
+          </w:tcPr>
+          <w:p/>
+        </w:tc>
+        <w:tc>
+          <w:tcPr>
+            <w:tcW w:w="2835" w:type="dxa"/>
+            <w:vMerge/>
+            <w:tcBorders>
+              <w:left w:val="single" w:sz="4" w:space="0" w:color="auto"/>
+              <w:right w:val="single" w:sz="4" w:space="0" w:color="auto"/>
+            </w:tcBorders>
+          </w:tcPr>
+          <w:p/>
+        </w:tc>
+        <w:tc>
+          <w:tcPr>
+            <w:tcW w:w="2835" w:type="dxa"/>
+            <w:tcBorders>
+              <w:left w:val="single" w:sz="4" w:space="0" w:color="auto"/>
+            </w:tcBorders>
+          </w:tcPr>
+          <w:p>
+            <w:pPr>
+              <w:jc w:val="center"/>
+              <w:rPr>
+                <w:u w:val="single"/>
+              </w:rPr>
+            </w:pPr>
+            <w:r>
+              <w:rPr>
+                <w:u w:val="single"/>
+              </w:rPr>
+              <w:t>to be remembered in the history books for decades to come!</w:t>
+            </w:r>
+          </w:p>
+        </w:tc>
+      </w:tr>
+    </w:tbl>
+    <w:p/>
+    <w:p/>
+    <w:p>
+      <w:r>
+        <w:t>Emus on the offensive</w:t>
+      </w:r>
+    </w:p>
+    <w:p>
+      <w:r>
+        <w:t>THE GREAT DEPRESSION IS AMONG US</w:t>
+      </w:r>
+    </w:p>
+    <w:p>
+      <w:r>
+        <w:t>PARTY</w:t>
+      </w:r>
+    </w:p>
+    <w:p>
+      <w:r>
+        <w:t>MODE</w:t>
+      </w:r>
+    </w:p>
+    <w:p>
+      <w:r>
+        <w:lastRenderedPageBreak/>
+        <w:t>PLAY</w:t>
+      </w:r>
+    </w:p>
+    <w:p>
+      <w:r>
+        <w:t>FEEDBACK</w:t>
+      </w:r>
+    </w:p>
+    <w:p>
+      <w:r>
+        <w:t>CREDITS</w:t>
+      </w:r>
+    </w:p>
+    <w:p>
+      <w:r>
+        <w:t>EXIT</w:t>
+      </w:r>
+    </w:p>
+    <w:p>
+      <w:r>
+        <w:t>IMAGE</w:t>
+      </w:r>
+    </w:p>
+    <w:p>
+      <w:r>
+        <w:t>MOTD</w:t>
+      </w:r>
+    </w:p>
     <w:sectPr>
       <w:pgSz w:w="11906" w:h="16838"/>
       <w:pgMar w:top="284" w:right="284" w:bottom="284" w:left="284" w:header="709" w:footer="709" w:gutter="0"/>
@@ -2348,7 +4275,7 @@
   <w:style w:type="paragraph" w:default="1" w:styleId="Normal">
     <w:name w:val="Normal"/>
     <w:qFormat/>
-    <w:rsid w:val="0056113E"/>
+    <w:rsid w:val="003C72F5"/>
     <w:pPr>
       <w:spacing w:after="0" w:line="240" w:lineRule="auto"/>
     </w:pPr>
@@ -2553,6 +4480,7 @@
   <w:style w:type="character" w:default="1" w:styleId="DefaultParagraphFont">
     <w:name w:val="Default Paragraph Font"/>
     <w:uiPriority w:val="1"/>
+    <w:semiHidden/>
     <w:unhideWhenUsed/>
   </w:style>
   <w:style w:type="table" w:default="1" w:styleId="TableNormal">

</xml_diff>